<commit_message>
Updated the la 6 document
</commit_message>
<xml_diff>
--- a/Lab 6/CEP Lab 6.docx
+++ b/Lab 6/CEP Lab 6.docx
@@ -4,9 +4,48 @@
   <w:body>
     <w:p>
       <w:pPr>
-        <w:spacing w:after="240" w:before="240" w:lineRule="auto"/>
-        <w:rPr/>
-      </w:pPr>
+        <w:pStyle w:val="Heading1"/>
+        <w:spacing w:after="240" w:before="240" w:lineRule="auto"/>
+        <w:rPr/>
+      </w:pPr>
+      <w:bookmarkStart w:colFirst="0" w:colLast="0" w:name="_ddysmmnhkz8f" w:id="0"/>
+      <w:bookmarkEnd w:id="0"/>
+      <w:r>
+        <w:rPr>
+          <w:rtl w:val="0"/>
+        </w:rPr>
+        <w:t xml:space="preserve">Lab 6</w:t>
+      </w:r>
+    </w:p>
+    <w:p>
+      <w:pPr>
+        <w:rPr/>
+      </w:pPr>
+      <w:r>
+        <w:rPr>
+          <w:rtl w:val="0"/>
+        </w:rPr>
+        <w:t xml:space="preserve">by : Anthony Garcia</w:t>
+      </w:r>
+    </w:p>
+    <w:p>
+      <w:pPr>
+        <w:rPr/>
+      </w:pPr>
+      <w:r>
+        <w:rPr>
+          <w:rtl w:val="0"/>
+        </w:rPr>
+      </w:r>
+    </w:p>
+    <w:p>
+      <w:pPr>
+        <w:pStyle w:val="Heading2"/>
+        <w:spacing w:after="240" w:before="240" w:lineRule="auto"/>
+        <w:rPr/>
+      </w:pPr>
+      <w:bookmarkStart w:colFirst="0" w:colLast="0" w:name="_tlsda1k0724n" w:id="1"/>
+      <w:bookmarkEnd w:id="1"/>
       <w:r>
         <w:rPr>
           <w:rtl w:val="0"/>
@@ -60,12 +99,12 @@
           <wp:inline distB="114300" distT="114300" distL="114300" distR="114300">
             <wp:extent cx="5943600" cy="3175000"/>
             <wp:effectExtent b="0" l="0" r="0" t="0"/>
-            <wp:docPr id="1" name="image4.png"/>
+            <wp:docPr id="1" name="image1.png"/>
             <a:graphic>
               <a:graphicData uri="http://schemas.openxmlformats.org/drawingml/2006/picture">
                 <pic:pic>
                   <pic:nvPicPr>
-                    <pic:cNvPr id="0" name="image4.png"/>
+                    <pic:cNvPr id="0" name="image1.png"/>
                     <pic:cNvPicPr preferRelativeResize="0"/>
                   </pic:nvPicPr>
                   <pic:blipFill>
@@ -130,30 +169,36 @@
         <w:rPr>
           <w:rtl w:val="0"/>
         </w:rPr>
-        <w:t xml:space="preserve">git diff HEAD~2 HEAD helped me understand the changes by showing the differences between two versions of my essay.</w:t>
-      </w:r>
-    </w:p>
-    <w:p>
-      <w:pPr>
-        <w:spacing w:after="240" w:before="240" w:lineRule="auto"/>
-        <w:rPr/>
-      </w:pPr>
-      <w:r>
-        <w:rPr>
-          <w:rtl w:val="0"/>
-        </w:rPr>
-      </w:r>
-    </w:p>
-    <w:p>
-      <w:pPr>
-        <w:spacing w:after="240" w:before="240" w:lineRule="auto"/>
-        <w:rPr/>
-      </w:pPr>
-      <w:r>
-        <w:rPr>
-          <w:rtl w:val="0"/>
-        </w:rPr>
-        <w:t xml:space="preserve">2. Can you see how your essay developed over time? Yes. Using </w:t>
+      </w:r>
+    </w:p>
+    <w:p>
+      <w:pPr>
+        <w:spacing w:after="240" w:before="240" w:lineRule="auto"/>
+        <w:rPr/>
+      </w:pPr>
+      <w:r>
+        <w:rPr>
+          <w:rtl w:val="0"/>
+        </w:rPr>
+        <w:t xml:space="preserve">2. Can you see how your essay developed over time? </w:t>
+      </w:r>
+    </w:p>
+    <w:p>
+      <w:pPr>
+        <w:spacing w:after="240" w:before="240" w:lineRule="auto"/>
+        <w:rPr/>
+      </w:pPr>
+      <w:r>
+        <w:rPr>
+          <w:rtl w:val="0"/>
+        </w:rPr>
+        <w:t xml:space="preserve">Using</w:t>
+      </w:r>
+      <w:r>
+        <w:rPr>
+          <w:rtl w:val="0"/>
+        </w:rPr>
+        <w:t xml:space="preserve"> </w:t>
       </w:r>
       <w:r>
         <w:rPr>
@@ -167,33 +212,7 @@
         <w:rPr>
           <w:rtl w:val="0"/>
         </w:rPr>
-        <w:t xml:space="preserve">, I can see the essay's development from the title to the introduction and then the body paragraph. This helps me track the progress of my work over time.</w:t>
-      </w:r>
-    </w:p>
-    <w:p>
-      <w:pPr>
-        <w:spacing w:after="240" w:before="240" w:lineRule="auto"/>
-        <w:rPr/>
-      </w:pPr>
-      <w:r>
-        <w:rPr>
-          <w:rtl w:val="0"/>
-        </w:rPr>
-        <w:t xml:space="preserve">Yes. Using </w:t>
-      </w:r>
-      <w:r>
-        <w:rPr>
-          <w:rFonts w:ascii="Roboto Mono" w:cs="Roboto Mono" w:eastAsia="Roboto Mono" w:hAnsi="Roboto Mono"/>
-          <w:color w:val="188038"/>
-          <w:rtl w:val="0"/>
-        </w:rPr>
-        <w:t xml:space="preserve">git log --oneline</w:t>
-      </w:r>
-      <w:r>
-        <w:rPr>
-          <w:rtl w:val="0"/>
-        </w:rPr>
-        <w:t xml:space="preserve">, I can see the essay's development from the title to the introduction and then the body paragraph. This helps me track the progress of my work over time.</w:t>
+        <w:t xml:space="preserve"> allows me to see the essay's development from the title to the introduction and then the body paragraph. This helps me track the progress of my work over time.</w:t>
       </w:r>
     </w:p>
     <w:p>
@@ -242,6 +261,20 @@
           <w:rtl w:val="0"/>
         </w:rPr>
         <w:t xml:space="preserve">Exercise 2</w:t>
+      </w:r>
+    </w:p>
+    <w:p>
+      <w:pPr>
+        <w:spacing w:after="240" w:before="240" w:lineRule="auto"/>
+        <w:rPr>
+          <w:rFonts w:ascii="Roboto Mono" w:cs="Roboto Mono" w:eastAsia="Roboto Mono" w:hAnsi="Roboto Mono"/>
+          <w:color w:val="188038"/>
+        </w:rPr>
+      </w:pPr>
+      <w:r>
+        <w:rPr>
+          <w:rtl w:val="0"/>
+        </w:rPr>
       </w:r>
     </w:p>
     <w:p>
@@ -261,12 +294,12 @@
           <wp:inline distB="114300" distT="114300" distL="114300" distR="114300">
             <wp:extent cx="6057900" cy="1893146"/>
             <wp:effectExtent b="0" l="0" r="0" t="0"/>
-            <wp:docPr id="3" name="image3.png"/>
+            <wp:docPr id="3" name="image2.png"/>
             <a:graphic>
               <a:graphicData uri="http://schemas.openxmlformats.org/drawingml/2006/picture">
                 <pic:pic>
                   <pic:nvPicPr>
-                    <pic:cNvPr id="0" name="image3.png"/>
+                    <pic:cNvPr id="0" name="image2.png"/>
                     <pic:cNvPicPr preferRelativeResize="0"/>
                   </pic:nvPicPr>
                   <pic:blipFill>
@@ -327,12 +360,12 @@
           <wp:inline distB="114300" distT="114300" distL="114300" distR="114300">
             <wp:extent cx="5943600" cy="2489200"/>
             <wp:effectExtent b="0" l="0" r="0" t="0"/>
-            <wp:docPr id="4" name="image1.png"/>
+            <wp:docPr id="4" name="image3.png"/>
             <a:graphic>
               <a:graphicData uri="http://schemas.openxmlformats.org/drawingml/2006/picture">
                 <pic:pic>
                   <pic:nvPicPr>
-                    <pic:cNvPr id="0" name="image1.png"/>
+                    <pic:cNvPr id="0" name="image3.png"/>
                     <pic:cNvPicPr preferRelativeResize="0"/>
                   </pic:nvPicPr>
                   <pic:blipFill>
@@ -383,6 +416,30 @@
           <w:rFonts w:ascii="Roboto Mono" w:cs="Roboto Mono" w:eastAsia="Roboto Mono" w:hAnsi="Roboto Mono"/>
         </w:rPr>
       </w:pPr>
+      <w:hyperlink r:id="rId10">
+        <w:r>
+          <w:rPr>
+            <w:rFonts w:ascii="Roboto Mono" w:cs="Roboto Mono" w:eastAsia="Roboto Mono" w:hAnsi="Roboto Mono"/>
+            <w:color w:val="1155cc"/>
+            <w:u w:val="single"/>
+            <w:rtl w:val="0"/>
+          </w:rPr>
+          <w:t xml:space="preserve">https://github.com/Anthony-Garcia1/forked-repository</w:t>
+        </w:r>
+      </w:hyperlink>
+      <w:r>
+        <w:rPr>
+          <w:rtl w:val="0"/>
+        </w:rPr>
+      </w:r>
+    </w:p>
+    <w:p>
+      <w:pPr>
+        <w:spacing w:after="240" w:before="240" w:lineRule="auto"/>
+        <w:rPr>
+          <w:rFonts w:ascii="Roboto Mono" w:cs="Roboto Mono" w:eastAsia="Roboto Mono" w:hAnsi="Roboto Mono"/>
+        </w:rPr>
+      </w:pPr>
       <w:r>
         <w:rPr>
           <w:rtl w:val="0"/>
@@ -430,16 +487,16 @@
           <wp:inline distB="114300" distT="114300" distL="114300" distR="114300">
             <wp:extent cx="5943600" cy="2895600"/>
             <wp:effectExtent b="0" l="0" r="0" t="0"/>
-            <wp:docPr id="2" name="image2.png"/>
+            <wp:docPr id="2" name="image4.png"/>
             <a:graphic>
               <a:graphicData uri="http://schemas.openxmlformats.org/drawingml/2006/picture">
                 <pic:pic>
                   <pic:nvPicPr>
-                    <pic:cNvPr id="0" name="image2.png"/>
+                    <pic:cNvPr id="0" name="image4.png"/>
                     <pic:cNvPicPr preferRelativeResize="0"/>
                   </pic:nvPicPr>
                   <pic:blipFill>
-                    <a:blip r:embed="rId10"/>
+                    <a:blip r:embed="rId11"/>
                     <a:srcRect b="0" l="0" r="0" t="0"/>
                     <a:stretch>
                       <a:fillRect/>

</xml_diff>